<commit_message>
feat: add Patna, Gaya and regional locations with showtimes; finalize Sprint 4 and UAT testing timeline (Oct 16-17)
</commit_message>
<xml_diff>
--- a/phase wise documents/Performance Testing/User Acceptance Testing (UAT) Template.docx
+++ b/phase wise documents/Performance Testing/User Acceptance Testing (UAT) Template.docx
@@ -143,7 +143,7 @@
                 <w:sz w:val="24"/>
                 <w:szCs w:val="24"/>
               </w:rPr>
-              <w:t>15-10-2026</w:t>
+              <w:t>17-10-2026</w:t>
             </w:r>
           </w:p>
         </w:tc>
@@ -505,7 +505,7 @@
         <w:rPr>
           <w:rFonts w:ascii="Calibri" w:eastAsia="Calibri" w:hAnsi="Calibri" w:cs="Calibri"/>
         </w:rPr>
-        <w:t>Testing Period: 2026-10-12 to 2026-10-15</w:t>
+        <w:t>Testing Period: 2026-10-14 to 2026-10-17</w:t>
       </w:r>
     </w:p>
     <w:p>
@@ -2785,7 +2785,7 @@
           <w:rFonts w:ascii="Calibri" w:eastAsia="Calibri" w:hAnsi="Calibri" w:cs="Calibri"/>
         </w:rPr>
         <w:lastRenderedPageBreak/>
-        <w:t>Date: 15-10-2026</w:t>
+        <w:t>Date: 17-10-2026</w:t>
       </w:r>
     </w:p>
     <w:p>

</xml_diff>